<commit_message>
Add/update eng data for UWTranslationNotes
</commit_message>
<xml_diff>
--- a/eng/docx/08.content.docx
+++ b/eng/docx/08.content.docx
@@ -1022,7 +1022,7 @@
           <w:i/>
           <w:lang w:val="en_US" w:bidi="en_US"/>
         </w:rPr>
-        <w:t>/tw/dict/bible/kt/faith]] and [[rc://</w:t>
+        <w:t>/tw/dict/bible/kt/faith]]; and [[rc://</w:t>
       </w:r>
       <w:r>
         <w:rPr>
@@ -8648,7 +8648,7 @@
           <w:i/>
           <w:lang w:val="en_US" w:bidi="en_US"/>
         </w:rPr>
-        <w:t>/tw/dict/bible/kt/grace]] and [[rc://</w:t>
+        <w:t>/tw/dict/bible/kt/grace]]; and [[rc://</w:t>
       </w:r>
       <w:r>
         <w:rPr>

</xml_diff>